<commit_message>
Connect Section 12 closeout evidence to actual attachments and source rows
</commit_message>
<xml_diff>
--- a/training/section-12/closeout-packet/output/materials-review.docx
+++ b/training/section-12/closeout-packet/output/materials-review.docx
@@ -90,7 +90,7 @@
             <w:r>
               <w:t>344条原记录，Adelie 152条，筛选后146条</w:t>
               <w:br/>
-              <w:t>依据：来源表与原始CSV</w:t>
+              <w:t>依据：附件A02、A03、A05</w:t>
             </w:r>
           </w:p>
         </w:tc>
@@ -124,7 +124,7 @@
             <w:r>
               <w:t>雌雄各73条，均值差4.62 mm</w:t>
               <w:br/>
-              <w:t>依据：计算结果与原始CSV</w:t>
+              <w:t>依据：附件A03、A04、A06</w:t>
             </w:r>
           </w:p>
         </w:tc>
@@ -158,7 +158,7 @@
             <w:r>
               <w:t>简化CSV缺个体标识及抽样设计资料</w:t>
               <w:br/>
-              <w:t>依据：简化CSV的列名</w:t>
+              <w:t>依据：附件A03列名与A08待补项</w:t>
             </w:r>
           </w:p>
         </w:tc>
@@ -282,6 +282,578 @@
     <w:p>
       <w:r>
         <w:t>本文件为AI编写的教学材料核对示例。国家自然科学基金委2026年通告第五部分第（二）项对生成式人工智能直接生成的项目进展和结题报告作出限制。本文件不能作为该类正式报告提交。</w:t>
+      </w:r>
+    </w:p>
+    <w:p>
+      <w:r>
+        <w:br w:type="page"/>
+      </w:r>
+    </w:p>
+    <w:p>
+      <w:pPr>
+        <w:pStyle w:val="Heading1"/>
+      </w:pPr>
+      <w:r>
+        <w:t>教学材料附件目录</w:t>
+      </w:r>
+    </w:p>
+    <w:p>
+      <w:r>
+        <w:t>附件编号供查找实际文件。输入、纳入记录与复算结果均保留；缺失的采样资料不列为已收附件。路径以closeout-packet目录为起点，完整SHA-256及文件大小见output/attachment-catalog.json。</w:t>
+      </w:r>
+    </w:p>
+    <w:tbl>
+      <w:tblPr>
+        <w:tblStyle w:val="TableGrid"/>
+        <w:tblW w:type="auto" w:w="0"/>
+        <w:tblLayout w:type="fixed"/>
+        <w:tblLook w:firstColumn="1" w:firstRow="1" w:lastColumn="0" w:lastRow="0" w:noHBand="0" w:noVBand="1" w:val="04A0"/>
+      </w:tblPr>
+      <w:tblGrid>
+        <w:gridCol w:w="680"/>
+        <w:gridCol w:w="4082"/>
+        <w:gridCol w:w="5210"/>
+      </w:tblGrid>
+      <w:tr>
+        <w:tc>
+          <w:tcPr>
+            <w:tcW w:type="dxa" w:w="680"/>
+          </w:tcPr>
+          <w:p>
+            <w:pPr>
+              <w:spacing w:after="80"/>
+            </w:pPr>
+            <w:r>
+              <w:rPr>
+                <w:sz w:val="18"/>
+              </w:rPr>
+              <w:t>编号</w:t>
+            </w:r>
+          </w:p>
+        </w:tc>
+        <w:tc>
+          <w:tcPr>
+            <w:tcW w:type="dxa" w:w="4082"/>
+          </w:tcPr>
+          <w:p>
+            <w:pPr>
+              <w:spacing w:after="80"/>
+            </w:pPr>
+            <w:r>
+              <w:rPr>
+                <w:sz w:val="18"/>
+              </w:rPr>
+              <w:t>材料与实际路径</w:t>
+            </w:r>
+          </w:p>
+        </w:tc>
+        <w:tc>
+          <w:tcPr>
+            <w:tcW w:type="dxa" w:w="5210"/>
+          </w:tcPr>
+          <w:p>
+            <w:pPr>
+              <w:spacing w:after="80"/>
+            </w:pPr>
+            <w:r>
+              <w:rPr>
+                <w:sz w:val="18"/>
+              </w:rPr>
+              <w:t>用于核对什么</w:t>
+            </w:r>
+          </w:p>
+        </w:tc>
+      </w:tr>
+      <w:tr>
+        <w:tc>
+          <w:tcPr>
+            <w:tcW w:type="dxa" w:w="680"/>
+          </w:tcPr>
+          <w:p>
+            <w:pPr>
+              <w:spacing w:after="80"/>
+            </w:pPr>
+            <w:r>
+              <w:rPr>
+                <w:sz w:val="18"/>
+              </w:rPr>
+              <w:t>A01</w:t>
+            </w:r>
+          </w:p>
+        </w:tc>
+        <w:tc>
+          <w:tcPr>
+            <w:tcW w:type="dxa" w:w="4082"/>
+          </w:tcPr>
+          <w:p>
+            <w:pPr>
+              <w:spacing w:after="80"/>
+            </w:pPr>
+            <w:r>
+              <w:rPr>
+                <w:sz w:val="18"/>
+              </w:rPr>
+              <w:t>自编核对要求</w:t>
+              <w:br/>
+              <w:t>input/taskbook.json</w:t>
+            </w:r>
+          </w:p>
+        </w:tc>
+        <w:tc>
+          <w:tcPr>
+            <w:tcW w:type="dxa" w:w="5210"/>
+          </w:tcPr>
+          <w:p>
+            <w:pPr>
+              <w:spacing w:after="80"/>
+            </w:pPr>
+            <w:r>
+              <w:rPr>
+                <w:sz w:val="18"/>
+              </w:rPr>
+              <w:t>M1/M2/M3</w:t>
+              <w:br/>
+              <w:t>requirements中的id、rule及expected</w:t>
+            </w:r>
+          </w:p>
+        </w:tc>
+      </w:tr>
+      <w:tr>
+        <w:tc>
+          <w:tcPr>
+            <w:tcW w:type="dxa" w:w="680"/>
+          </w:tcPr>
+          <w:p>
+            <w:pPr>
+              <w:spacing w:after="80"/>
+            </w:pPr>
+            <w:r>
+              <w:rPr>
+                <w:sz w:val="18"/>
+              </w:rPr>
+              <w:t>A02</w:t>
+            </w:r>
+          </w:p>
+        </w:tc>
+        <w:tc>
+          <w:tcPr>
+            <w:tcW w:type="dxa" w:w="4082"/>
+          </w:tcPr>
+          <w:p>
+            <w:pPr>
+              <w:spacing w:after="80"/>
+            </w:pPr>
+            <w:r>
+              <w:rPr>
+                <w:sz w:val="18"/>
+              </w:rPr>
+              <w:t>公开数据来源</w:t>
+              <w:br/>
+              <w:t>input/source.json</w:t>
+            </w:r>
+          </w:p>
+        </w:tc>
+        <w:tc>
+          <w:tcPr>
+            <w:tcW w:type="dxa" w:w="5210"/>
+          </w:tcPr>
+          <w:p>
+            <w:pPr>
+              <w:spacing w:after="80"/>
+            </w:pPr>
+            <w:r>
+              <w:rPr>
+                <w:sz w:val="18"/>
+              </w:rPr>
+              <w:t>M1</w:t>
+              <w:br/>
+              <w:t>原始URL、许可及CSV哈希</w:t>
+            </w:r>
+          </w:p>
+        </w:tc>
+      </w:tr>
+      <w:tr>
+        <w:tc>
+          <w:tcPr>
+            <w:tcW w:type="dxa" w:w="680"/>
+          </w:tcPr>
+          <w:p>
+            <w:pPr>
+              <w:spacing w:after="80"/>
+            </w:pPr>
+            <w:r>
+              <w:rPr>
+                <w:sz w:val="18"/>
+              </w:rPr>
+              <w:t>A03</w:t>
+            </w:r>
+          </w:p>
+        </w:tc>
+        <w:tc>
+          <w:tcPr>
+            <w:tcW w:type="dxa" w:w="4082"/>
+          </w:tcPr>
+          <w:p>
+            <w:pPr>
+              <w:spacing w:after="80"/>
+            </w:pPr>
+            <w:r>
+              <w:rPr>
+                <w:sz w:val="18"/>
+              </w:rPr>
+              <w:t>原始简化数据</w:t>
+              <w:br/>
+              <w:t>input/penguins.csv</w:t>
+            </w:r>
+          </w:p>
+        </w:tc>
+        <w:tc>
+          <w:tcPr>
+            <w:tcW w:type="dxa" w:w="5210"/>
+          </w:tcPr>
+          <w:p>
+            <w:pPr>
+              <w:spacing w:after="80"/>
+            </w:pPr>
+            <w:r>
+              <w:rPr>
+                <w:sz w:val="18"/>
+              </w:rPr>
+              <w:t>M1/M2/M3</w:t>
+              <w:br/>
+              <w:t>species、sex、flipper_length_mm列；不含所需个体及抽样字段</w:t>
+            </w:r>
+          </w:p>
+        </w:tc>
+      </w:tr>
+      <w:tr>
+        <w:tc>
+          <w:tcPr>
+            <w:tcW w:type="dxa" w:w="680"/>
+          </w:tcPr>
+          <w:p>
+            <w:pPr>
+              <w:spacing w:after="80"/>
+            </w:pPr>
+            <w:r>
+              <w:rPr>
+                <w:sz w:val="18"/>
+              </w:rPr>
+              <w:t>A04</w:t>
+            </w:r>
+          </w:p>
+        </w:tc>
+        <w:tc>
+          <w:tcPr>
+            <w:tcW w:type="dxa" w:w="4082"/>
+          </w:tcPr>
+          <w:p>
+            <w:pPr>
+              <w:spacing w:after="80"/>
+            </w:pPr>
+            <w:r>
+              <w:rPr>
+                <w:sz w:val="18"/>
+              </w:rPr>
+              <w:t>本地复算程序</w:t>
+              <w:br/>
+              <w:t>../run_closeout.py</w:t>
+            </w:r>
+          </w:p>
+        </w:tc>
+        <w:tc>
+          <w:tcPr>
+            <w:tcW w:type="dxa" w:w="5210"/>
+          </w:tcPr>
+          <w:p>
+            <w:pPr>
+              <w:spacing w:after="80"/>
+            </w:pPr>
+            <w:r>
+              <w:rPr>
+                <w:sz w:val="18"/>
+              </w:rPr>
+              <w:t>M1/M2</w:t>
+              <w:br/>
+              <w:t>run函数中的筛选、计算及状态判断</w:t>
+            </w:r>
+          </w:p>
+        </w:tc>
+      </w:tr>
+      <w:tr>
+        <w:tc>
+          <w:tcPr>
+            <w:tcW w:type="dxa" w:w="680"/>
+          </w:tcPr>
+          <w:p>
+            <w:pPr>
+              <w:spacing w:after="80"/>
+            </w:pPr>
+            <w:r>
+              <w:rPr>
+                <w:sz w:val="18"/>
+              </w:rPr>
+              <w:t>A05</w:t>
+            </w:r>
+          </w:p>
+        </w:tc>
+        <w:tc>
+          <w:tcPr>
+            <w:tcW w:type="dxa" w:w="4082"/>
+          </w:tcPr>
+          <w:p>
+            <w:pPr>
+              <w:spacing w:after="80"/>
+            </w:pPr>
+            <w:r>
+              <w:rPr>
+                <w:sz w:val="18"/>
+              </w:rPr>
+              <w:t>实际纳入记录</w:t>
+              <w:br/>
+              <w:t>output/retained-rows.csv</w:t>
+            </w:r>
+          </w:p>
+        </w:tc>
+        <w:tc>
+          <w:tcPr>
+            <w:tcW w:type="dxa" w:w="5210"/>
+          </w:tcPr>
+          <w:p>
+            <w:pPr>
+              <w:spacing w:after="80"/>
+            </w:pPr>
+            <w:r>
+              <w:rPr>
+                <w:sz w:val="18"/>
+              </w:rPr>
+              <w:t>M1/M2</w:t>
+              <w:br/>
+              <w:t>146行；csv_physical_line回查原CSV，首行为表头</w:t>
+            </w:r>
+          </w:p>
+        </w:tc>
+      </w:tr>
+      <w:tr>
+        <w:tc>
+          <w:tcPr>
+            <w:tcW w:type="dxa" w:w="680"/>
+          </w:tcPr>
+          <w:p>
+            <w:pPr>
+              <w:spacing w:after="80"/>
+            </w:pPr>
+            <w:r>
+              <w:rPr>
+                <w:sz w:val="18"/>
+              </w:rPr>
+              <w:t>A06</w:t>
+            </w:r>
+          </w:p>
+        </w:tc>
+        <w:tc>
+          <w:tcPr>
+            <w:tcW w:type="dxa" w:w="4082"/>
+          </w:tcPr>
+          <w:p>
+            <w:pPr>
+              <w:spacing w:after="80"/>
+            </w:pPr>
+            <w:r>
+              <w:rPr>
+                <w:sz w:val="18"/>
+              </w:rPr>
+              <w:t>统计计算结果</w:t>
+              <w:br/>
+              <w:t>output/calculation.json</w:t>
+            </w:r>
+          </w:p>
+        </w:tc>
+        <w:tc>
+          <w:tcPr>
+            <w:tcW w:type="dxa" w:w="5210"/>
+          </w:tcPr>
+          <w:p>
+            <w:pPr>
+              <w:spacing w:after="80"/>
+            </w:pPr>
+            <w:r>
+              <w:rPr>
+                <w:sz w:val="18"/>
+              </w:rPr>
+              <w:t>M1/M2</w:t>
+              <w:br/>
+              <w:t>analysis_rows、female_n、male_n、mean_difference_mm</w:t>
+            </w:r>
+          </w:p>
+        </w:tc>
+      </w:tr>
+      <w:tr>
+        <w:tc>
+          <w:tcPr>
+            <w:tcW w:type="dxa" w:w="680"/>
+          </w:tcPr>
+          <w:p>
+            <w:pPr>
+              <w:spacing w:after="80"/>
+            </w:pPr>
+            <w:r>
+              <w:rPr>
+                <w:sz w:val="18"/>
+              </w:rPr>
+              <w:t>A07</w:t>
+            </w:r>
+          </w:p>
+        </w:tc>
+        <w:tc>
+          <w:tcPr>
+            <w:tcW w:type="dxa" w:w="4082"/>
+          </w:tcPr>
+          <w:p>
+            <w:pPr>
+              <w:spacing w:after="80"/>
+            </w:pPr>
+            <w:r>
+              <w:rPr>
+                <w:sz w:val="18"/>
+              </w:rPr>
+              <w:t>任务证据对应</w:t>
+              <w:br/>
+              <w:t>output/evidence-matrix.csv</w:t>
+            </w:r>
+          </w:p>
+        </w:tc>
+        <w:tc>
+          <w:tcPr>
+            <w:tcW w:type="dxa" w:w="5210"/>
+          </w:tcPr>
+          <w:p>
+            <w:pPr>
+              <w:spacing w:after="80"/>
+            </w:pPr>
+            <w:r>
+              <w:rPr>
+                <w:sz w:val="18"/>
+              </w:rPr>
+              <w:t>M1/M2/M3</w:t>
+              <w:br/>
+              <w:t>M1/M2为材料已核，M3为待补资料</w:t>
+            </w:r>
+          </w:p>
+        </w:tc>
+      </w:tr>
+      <w:tr>
+        <w:tc>
+          <w:tcPr>
+            <w:tcW w:type="dxa" w:w="680"/>
+          </w:tcPr>
+          <w:p>
+            <w:pPr>
+              <w:spacing w:after="80"/>
+            </w:pPr>
+            <w:r>
+              <w:rPr>
+                <w:sz w:val="18"/>
+              </w:rPr>
+              <w:t>A08</w:t>
+            </w:r>
+          </w:p>
+        </w:tc>
+        <w:tc>
+          <w:tcPr>
+            <w:tcW w:type="dxa" w:w="4082"/>
+          </w:tcPr>
+          <w:p>
+            <w:pPr>
+              <w:spacing w:after="80"/>
+            </w:pPr>
+            <w:r>
+              <w:rPr>
+                <w:sz w:val="18"/>
+              </w:rPr>
+              <w:t>待补与待核事项</w:t>
+              <w:br/>
+              <w:t>output/issues.json</w:t>
+            </w:r>
+          </w:p>
+        </w:tc>
+        <w:tc>
+          <w:tcPr>
+            <w:tcW w:type="dxa" w:w="5210"/>
+          </w:tcPr>
+          <w:p>
+            <w:pPr>
+              <w:spacing w:after="80"/>
+            </w:pPr>
+            <w:r>
+              <w:rPr>
+                <w:sz w:val="18"/>
+              </w:rPr>
+              <w:t>M3/科学解释核对</w:t>
+              <w:br/>
+              <w:t>SAMPLING、SIGNOFF均待核</w:t>
+            </w:r>
+          </w:p>
+        </w:tc>
+      </w:tr>
+      <w:tr>
+        <w:tc>
+          <w:tcPr>
+            <w:tcW w:type="dxa" w:w="680"/>
+          </w:tcPr>
+          <w:p>
+            <w:pPr>
+              <w:spacing w:after="80"/>
+            </w:pPr>
+            <w:r>
+              <w:rPr>
+                <w:sz w:val="18"/>
+              </w:rPr>
+              <w:t>A09</w:t>
+            </w:r>
+          </w:p>
+        </w:tc>
+        <w:tc>
+          <w:tcPr>
+            <w:tcW w:type="dxa" w:w="4082"/>
+          </w:tcPr>
+          <w:p>
+            <w:pPr>
+              <w:spacing w:after="80"/>
+            </w:pPr>
+            <w:r>
+              <w:rPr>
+                <w:sz w:val="18"/>
+              </w:rPr>
+              <w:t>排除的主张</w:t>
+              <w:br/>
+              <w:t>output/excluded-claims.json</w:t>
+            </w:r>
+          </w:p>
+        </w:tc>
+        <w:tc>
+          <w:tcPr>
+            <w:tcW w:type="dxa" w:w="5210"/>
+          </w:tcPr>
+          <w:p>
+            <w:pPr>
+              <w:spacing w:after="80"/>
+            </w:pPr>
+            <w:r>
+              <w:rPr>
+                <w:sz w:val="18"/>
+              </w:rPr>
+              <w:t>成果表述</w:t>
+              <w:br/>
+              <w:t>自采数据与已证因果两项说法均无支持</w:t>
+            </w:r>
+          </w:p>
+        </w:tc>
+      </w:tr>
+    </w:tbl>
+    <w:p>
+      <w:r>
+        <w:t>科学判断仍待核对：个体重复、采样依赖及外推范围尚未确认。当前材料没有经费凭证、成果登记证书或正式签核记录，不能据此确认项目已验收。</w:t>
       </w:r>
     </w:p>
     <w:sectPr>
@@ -1014,7 +1586,7 @@
       <w:color w:val="000000"/>
       <w:spacing w:val="5"/>
       <w:kern w:val="28"/>
-      <w:sz w:val="42"/>
+      <w:sz w:val="36"/>
       <w:szCs w:val="52"/>
     </w:rPr>
   </w:style>

</xml_diff>